<commit_message>
Można pobrać załącznik 9,1,2 po ich ukończeniu
</commit_message>
<xml_diff>
--- a/Projekt/app/docs/Zal_1.docx
+++ b/Projekt/app/docs/Zal_1.docx
@@ -8,7 +8,6 @@
         <w:rPr>
           <w:b/>
           <w:i/>
-          <w:sz w:val="24"/>
         </w:rPr>
       </w:pPr>
       <w:r>
@@ -17,23 +16,54 @@
           <w:i/>
           <w:sz w:val="24"/>
         </w:rPr>
-        <w:t>Porozumienie Nr</w:t>
+        <w:t xml:space="preserve">Porozumienie </w:t>
       </w:r>
       <w:r>
         <w:rPr>
           <w:b/>
           <w:i/>
           <w:sz w:val="24"/>
-        </w:rPr>
-        <w:t xml:space="preserve"> </w:t>
+          <w:szCs w:val="24"/>
+        </w:rPr>
+        <w:t>Nr</w:t>
       </w:r>
       <w:r>
         <w:rPr>
           <w:b/>
           <w:i/>
           <w:sz w:val="24"/>
-        </w:rPr>
-        <w:t>……….</w:t>
+          <w:szCs w:val="24"/>
+        </w:rPr>
+        <w:t xml:space="preserve"> </w:t>
+      </w:r>
+      <w:r>
+        <w:rPr>
+          <w:b/>
+          <w:i/>
+          <w:sz w:val="24"/>
+          <w:szCs w:val="24"/>
+        </w:rPr>
+        <w:t xml:space="preserve">{{ </w:t>
+      </w:r>
+      <w:proofErr w:type="spellStart"/>
+      <w:r>
+        <w:rPr>
+          <w:b/>
+          <w:i/>
+          <w:sz w:val="24"/>
+          <w:szCs w:val="24"/>
+        </w:rPr>
+        <w:t>nr_porozumienia</w:t>
+      </w:r>
+      <w:proofErr w:type="spellEnd"/>
+      <w:r>
+        <w:rPr>
+          <w:b/>
+          <w:i/>
+          <w:sz w:val="24"/>
+          <w:szCs w:val="24"/>
+        </w:rPr>
+        <w:t xml:space="preserve"> }}</w:t>
       </w:r>
     </w:p>
     <w:p>
@@ -90,14 +120,23 @@
           <w:color w:val="000000"/>
           <w:sz w:val="20"/>
         </w:rPr>
-        <w:t>………….</w:t>
-      </w:r>
-      <w:r>
-        <w:rPr>
-          <w:color w:val="000000"/>
-          <w:sz w:val="20"/>
-        </w:rPr>
-        <w:t>.</w:t>
+        <w:t xml:space="preserve">{{ </w:t>
+      </w:r>
+      <w:proofErr w:type="spellStart"/>
+      <w:r>
+        <w:rPr>
+          <w:color w:val="000000"/>
+          <w:sz w:val="20"/>
+        </w:rPr>
+        <w:t>data_zawarcia</w:t>
+      </w:r>
+      <w:proofErr w:type="spellEnd"/>
+      <w:r>
+        <w:rPr>
+          <w:color w:val="000000"/>
+          <w:sz w:val="20"/>
+        </w:rPr>
+        <w:t xml:space="preserve"> }}</w:t>
       </w:r>
       <w:r>
         <w:rPr>
@@ -144,15 +183,7 @@
           <w:color w:val="000000"/>
           <w:sz w:val="20"/>
         </w:rPr>
-        <w:t xml:space="preserve">, </w:t>
-      </w:r>
-      <w:r>
-        <w:rPr>
-          <w:color w:val="000000"/>
-          <w:sz w:val="20"/>
-        </w:rPr>
-        <w:br/>
-        <w:t>82-300 Elbląg</w:t>
+        <w:t>, 82-300 Elbląg</w:t>
       </w:r>
       <w:r>
         <w:rPr>
@@ -174,6 +205,106 @@
           <w:sz w:val="20"/>
         </w:rPr>
         <w:t xml:space="preserve">” reprezentowaną przez </w:t>
+      </w:r>
+      <w:r>
+        <w:rPr>
+          <w:color w:val="000000"/>
+          <w:sz w:val="20"/>
+        </w:rPr>
+        <w:t xml:space="preserve">{{ </w:t>
+      </w:r>
+      <w:proofErr w:type="spellStart"/>
+      <w:r>
+        <w:rPr>
+          <w:color w:val="000000"/>
+          <w:sz w:val="20"/>
+        </w:rPr>
+        <w:t>reprezentant.imie</w:t>
+      </w:r>
+      <w:proofErr w:type="spellEnd"/>
+      <w:r>
+        <w:rPr>
+          <w:color w:val="000000"/>
+          <w:sz w:val="20"/>
+        </w:rPr>
+        <w:t xml:space="preserve"> }} {{</w:t>
+      </w:r>
+      <w:proofErr w:type="spellStart"/>
+      <w:r>
+        <w:rPr>
+          <w:color w:val="000000"/>
+          <w:sz w:val="20"/>
+        </w:rPr>
+        <w:t>reprezentant.nazwisko</w:t>
+      </w:r>
+      <w:proofErr w:type="spellEnd"/>
+      <w:r>
+        <w:rPr>
+          <w:color w:val="000000"/>
+          <w:sz w:val="20"/>
+        </w:rPr>
+        <w:t xml:space="preserve"> </w:t>
+      </w:r>
+      <w:r>
+        <w:rPr>
+          <w:color w:val="000000"/>
+          <w:sz w:val="20"/>
+        </w:rPr>
+        <w:t>}}</w:t>
+      </w:r>
+      <w:r>
+        <w:rPr>
+          <w:color w:val="000000"/>
+          <w:sz w:val="20"/>
+        </w:rPr>
+        <w:t xml:space="preserve"> </w:t>
+      </w:r>
+      <w:r>
+        <w:rPr>
+          <w:color w:val="000000"/>
+          <w:sz w:val="20"/>
+        </w:rPr>
+        <w:t>z jednej strony</w:t>
+      </w:r>
+      <w:r>
+        <w:rPr>
+          <w:color w:val="000000"/>
+          <w:sz w:val="20"/>
+        </w:rPr>
+        <w:t>,</w:t>
+      </w:r>
+      <w:r>
+        <w:rPr>
+          <w:color w:val="000000"/>
+          <w:sz w:val="20"/>
+        </w:rPr>
+        <w:t xml:space="preserve"> a </w:t>
+      </w:r>
+      <w:r>
+        <w:rPr>
+          <w:b/>
+          <w:color w:val="000000"/>
+          <w:sz w:val="20"/>
+        </w:rPr>
+        <w:t xml:space="preserve">{{ </w:t>
+      </w:r>
+      <w:proofErr w:type="spellStart"/>
+      <w:r>
+        <w:rPr>
+          <w:b/>
+          <w:color w:val="000000"/>
+          <w:sz w:val="20"/>
+        </w:rPr>
+        <w:t>dokument_data.nazwa_zakladu_pracy</w:t>
+      </w:r>
+      <w:proofErr w:type="spellEnd"/>
+      <w:r>
+        <w:rPr>
+          <w:b/>
+          <w:color w:val="000000"/>
+          <w:sz w:val="20"/>
+        </w:rPr>
+        <w:t xml:space="preserve"> }}</w:t>
       </w:r>
       <w:r>
         <w:rPr>
@@ -182,12 +313,12 @@
           <w:color w:val="000000"/>
           <w:sz w:val="20"/>
         </w:rPr>
-        <w:t>………………………………</w:t>
-      </w:r>
-      <w:r>
-        <w:rPr>
-          <w:color w:val="000000"/>
-          <w:sz w:val="20"/>
+        <w:t>,</w:t>
+      </w:r>
+      <w:r>
+        <w:rPr>
+          <w:b/>
+          <w:iCs/>
         </w:rPr>
         <w:t xml:space="preserve"> </w:t>
       </w:r>
@@ -196,29 +327,51 @@
           <w:color w:val="000000"/>
           <w:sz w:val="20"/>
         </w:rPr>
-        <w:t>z jednej strony</w:t>
-      </w:r>
-      <w:r>
-        <w:rPr>
-          <w:color w:val="000000"/>
-          <w:sz w:val="20"/>
-        </w:rPr>
-        <w:t>,</w:t>
-      </w:r>
-      <w:r>
-        <w:rPr>
-          <w:color w:val="000000"/>
-          <w:sz w:val="20"/>
-        </w:rPr>
-        <w:t xml:space="preserve"> a </w:t>
-      </w:r>
-      <w:r>
-        <w:rPr>
-          <w:b/>
+        <w:t>zwanym dalej „</w:t>
+      </w:r>
+      <w:r>
+        <w:rPr>
+          <w:color w:val="000000"/>
+          <w:sz w:val="20"/>
+        </w:rPr>
+        <w:t>Z</w:t>
+      </w:r>
+      <w:r>
+        <w:rPr>
+          <w:color w:val="000000"/>
+          <w:sz w:val="20"/>
+        </w:rPr>
+        <w:t>akładem pracy”, reprezentowanym przez</w:t>
+      </w:r>
+      <w:r>
+        <w:rPr>
           <w:color w:val="000000"/>
           <w:sz w:val="20"/>
         </w:rPr>
         <w:t xml:space="preserve"> </w:t>
+      </w:r>
+      <w:r>
+        <w:rPr>
+          <w:color w:val="000000"/>
+          <w:sz w:val="20"/>
+        </w:rPr>
+        <w:t xml:space="preserve">{{ </w:t>
+      </w:r>
+      <w:proofErr w:type="spellStart"/>
+      <w:r>
+        <w:rPr>
+          <w:color w:val="000000"/>
+          <w:sz w:val="20"/>
+        </w:rPr>
+        <w:t>dokument_data.reprezentant_firmy</w:t>
+      </w:r>
+      <w:proofErr w:type="spellEnd"/>
+      <w:r>
+        <w:rPr>
+          <w:color w:val="000000"/>
+          <w:sz w:val="20"/>
+        </w:rPr>
+        <w:t xml:space="preserve"> }}</w:t>
       </w:r>
       <w:r>
         <w:rPr>
@@ -227,73 +380,11 @@
           <w:color w:val="000000"/>
           <w:sz w:val="20"/>
         </w:rPr>
-        <w:t>……………………………….</w:t>
+        <w:t xml:space="preserve"> </w:t>
       </w:r>
       <w:r>
         <w:rPr>
           <w:b/>
-          <w:i/>
-          <w:color w:val="000000"/>
-          <w:sz w:val="20"/>
-        </w:rPr>
-        <w:t>,</w:t>
-      </w:r>
-      <w:r>
-        <w:rPr>
-          <w:b/>
-          <w:iCs/>
-        </w:rPr>
-        <w:t xml:space="preserve"> </w:t>
-      </w:r>
-      <w:r>
-        <w:rPr>
-          <w:color w:val="000000"/>
-          <w:sz w:val="20"/>
-        </w:rPr>
-        <w:t>zwanym dalej „</w:t>
-      </w:r>
-      <w:r>
-        <w:rPr>
-          <w:color w:val="000000"/>
-          <w:sz w:val="20"/>
-        </w:rPr>
-        <w:t>Z</w:t>
-      </w:r>
-      <w:r>
-        <w:rPr>
-          <w:color w:val="000000"/>
-          <w:sz w:val="20"/>
-        </w:rPr>
-        <w:t>akładem pracy”, reprezentowanym przez</w:t>
-      </w:r>
-      <w:r>
-        <w:rPr>
-          <w:color w:val="000000"/>
-          <w:sz w:val="20"/>
-        </w:rPr>
-        <w:t xml:space="preserve"> </w:t>
-      </w:r>
-      <w:r>
-        <w:rPr>
-          <w:b/>
-          <w:i/>
-          <w:color w:val="000000"/>
-          <w:sz w:val="20"/>
-        </w:rPr>
-        <w:t>………………………..</w:t>
-      </w:r>
-      <w:r>
-        <w:rPr>
-          <w:b/>
-          <w:i/>
-          <w:color w:val="000000"/>
-          <w:sz w:val="20"/>
-        </w:rPr>
-        <w:t xml:space="preserve"> </w:t>
-      </w:r>
-      <w:r>
-        <w:rPr>
-          <w:b/>
           <w:color w:val="000000"/>
           <w:sz w:val="20"/>
         </w:rPr>
@@ -304,7 +395,7 @@
           <w:color w:val="000000"/>
           <w:sz w:val="20"/>
         </w:rPr>
-        <w:t>– z drugiej strony.</w:t>
+        <w:t xml:space="preserve"> z drugiej strony.</w:t>
       </w:r>
     </w:p>
     <w:p>
@@ -389,10 +480,10 @@
         <w:tblLook w:val="0000" w:firstRow="0" w:lastRow="0" w:firstColumn="0" w:lastColumn="0" w:noHBand="0" w:noVBand="0"/>
       </w:tblPr>
       <w:tblGrid>
-        <w:gridCol w:w="493"/>
-        <w:gridCol w:w="2193"/>
-        <w:gridCol w:w="2923"/>
-        <w:gridCol w:w="2990"/>
+        <w:gridCol w:w="484"/>
+        <w:gridCol w:w="2117"/>
+        <w:gridCol w:w="2954"/>
+        <w:gridCol w:w="3044"/>
       </w:tblGrid>
       <w:tr>
         <w:trPr>
@@ -603,6 +694,50 @@
                 <w:highlight w:val="yellow"/>
               </w:rPr>
             </w:pPr>
+            <w:r>
+              <w:rPr>
+                <w:b/>
+                <w:color w:val="000000"/>
+                <w:sz w:val="20"/>
+              </w:rPr>
+              <w:t xml:space="preserve">{{ </w:t>
+            </w:r>
+            <w:proofErr w:type="spellStart"/>
+            <w:r>
+              <w:rPr>
+                <w:b/>
+                <w:color w:val="000000"/>
+                <w:sz w:val="20"/>
+              </w:rPr>
+              <w:t>student.imie</w:t>
+            </w:r>
+            <w:proofErr w:type="spellEnd"/>
+            <w:r>
+              <w:rPr>
+                <w:b/>
+                <w:color w:val="000000"/>
+                <w:sz w:val="20"/>
+              </w:rPr>
+              <w:t xml:space="preserve"> }} {{ </w:t>
+            </w:r>
+            <w:proofErr w:type="spellStart"/>
+            <w:r>
+              <w:rPr>
+                <w:b/>
+                <w:color w:val="000000"/>
+                <w:sz w:val="20"/>
+              </w:rPr>
+              <w:t>student.nazwisko</w:t>
+            </w:r>
+            <w:proofErr w:type="spellEnd"/>
+            <w:r>
+              <w:rPr>
+                <w:b/>
+                <w:color w:val="000000"/>
+                <w:sz w:val="20"/>
+              </w:rPr>
+              <w:t xml:space="preserve"> }}</w:t>
+            </w:r>
           </w:p>
         </w:tc>
         <w:tc>
@@ -624,9 +759,52 @@
                 <w:b/>
                 <w:color w:val="000000"/>
                 <w:sz w:val="20"/>
-                <w:highlight w:val="yellow"/>
               </w:rPr>
             </w:pPr>
+            <w:r>
+              <w:rPr>
+                <w:b/>
+                <w:color w:val="000000"/>
+                <w:sz w:val="20"/>
+              </w:rPr>
+              <w:t xml:space="preserve">{{ </w:t>
+            </w:r>
+            <w:proofErr w:type="spellStart"/>
+            <w:r>
+              <w:rPr>
+                <w:b/>
+                <w:color w:val="000000"/>
+                <w:sz w:val="20"/>
+              </w:rPr>
+              <w:t>dokument_data.termin_od</w:t>
+            </w:r>
+            <w:proofErr w:type="spellEnd"/>
+            <w:r>
+              <w:rPr>
+                <w:b/>
+                <w:color w:val="000000"/>
+                <w:sz w:val="20"/>
+              </w:rPr>
+              <w:t xml:space="preserve"> }} - {{ </w:t>
+            </w:r>
+            <w:proofErr w:type="spellStart"/>
+            <w:r>
+              <w:rPr>
+                <w:b/>
+                <w:color w:val="000000"/>
+                <w:sz w:val="20"/>
+              </w:rPr>
+              <w:t>dokument_data.termin_do</w:t>
+            </w:r>
+            <w:proofErr w:type="spellEnd"/>
+            <w:r>
+              <w:rPr>
+                <w:b/>
+                <w:color w:val="000000"/>
+                <w:sz w:val="20"/>
+              </w:rPr>
+              <w:t xml:space="preserve"> }}</w:t>
+            </w:r>
           </w:p>
         </w:tc>
         <w:tc>
@@ -648,9 +826,37 @@
                 <w:color w:val="000000"/>
                 <w:sz w:val="18"/>
                 <w:szCs w:val="18"/>
-                <w:highlight w:val="yellow"/>
               </w:rPr>
             </w:pPr>
+            <w:r>
+              <w:rPr>
+                <w:b/>
+                <w:color w:val="000000"/>
+                <w:sz w:val="20"/>
+                <w:szCs w:val="20"/>
+              </w:rPr>
+              <w:t xml:space="preserve">{{ </w:t>
+            </w:r>
+            <w:proofErr w:type="spellStart"/>
+            <w:r>
+              <w:rPr>
+                <w:b/>
+                <w:color w:val="000000"/>
+                <w:sz w:val="20"/>
+                <w:szCs w:val="20"/>
+              </w:rPr>
+              <w:t>dokument_data.wymiar_praktyki</w:t>
+            </w:r>
+            <w:proofErr w:type="spellEnd"/>
+            <w:r>
+              <w:rPr>
+                <w:b/>
+                <w:color w:val="000000"/>
+                <w:sz w:val="20"/>
+                <w:szCs w:val="20"/>
+              </w:rPr>
+              <w:t xml:space="preserve"> }}</w:t>
+            </w:r>
           </w:p>
         </w:tc>
       </w:tr>
@@ -994,7 +1200,23 @@
           <w:color w:val="000000"/>
           <w:sz w:val="20"/>
         </w:rPr>
-        <w:t>sprawowania nadzoru dydaktyczno – wychowawczego oraz organizacyjnego nad przebiegiem praktyk</w:t>
+        <w:t xml:space="preserve">sprawowania nadzoru </w:t>
+      </w:r>
+      <w:proofErr w:type="spellStart"/>
+      <w:r>
+        <w:rPr>
+          <w:color w:val="000000"/>
+          <w:sz w:val="20"/>
+        </w:rPr>
+        <w:t>dydaktyczno</w:t>
+      </w:r>
+      <w:proofErr w:type="spellEnd"/>
+      <w:r>
+        <w:rPr>
+          <w:color w:val="000000"/>
+          <w:sz w:val="20"/>
+        </w:rPr>
+        <w:t xml:space="preserve"> – wychowawczego oraz organizacyjnego nad przebiegiem praktyk</w:t>
       </w:r>
       <w:r>
         <w:rPr>
@@ -1404,7 +1626,76 @@
           <w:color w:val="000000"/>
           <w:sz w:val="20"/>
         </w:rPr>
-        <w:t>........................................................................                       ......................................................................................</w:t>
+        <w:t xml:space="preserve">                      </w:t>
+      </w:r>
+      <w:r>
+        <w:rPr>
+          <w:color w:val="000000"/>
+          <w:sz w:val="20"/>
+        </w:rPr>
+        <w:t xml:space="preserve">{{ </w:t>
+      </w:r>
+      <w:proofErr w:type="spellStart"/>
+      <w:r>
+        <w:rPr>
+          <w:color w:val="000000"/>
+          <w:sz w:val="20"/>
+        </w:rPr>
+        <w:t>dokument_data.get</w:t>
+      </w:r>
+      <w:proofErr w:type="spellEnd"/>
+      <w:r>
+        <w:rPr>
+          <w:color w:val="000000"/>
+          <w:sz w:val="20"/>
+        </w:rPr>
+        <w:t xml:space="preserve">('dyrektor', </w:t>
+      </w:r>
+      <w:proofErr w:type="spellStart"/>
+      <w:r>
+        <w:rPr>
+          <w:color w:val="000000"/>
+          <w:sz w:val="20"/>
+        </w:rPr>
+        <w:t>director_full_name</w:t>
+      </w:r>
+      <w:proofErr w:type="spellEnd"/>
+      <w:r>
+        <w:rPr>
+          <w:color w:val="000000"/>
+          <w:sz w:val="20"/>
+        </w:rPr>
+        <w:t>) }}</w:t>
+      </w:r>
+      <w:r>
+        <w:rPr>
+          <w:color w:val="000000"/>
+          <w:sz w:val="20"/>
+        </w:rPr>
+        <w:t xml:space="preserve">                                                                            </w:t>
+      </w:r>
+      <w:r>
+        <w:rPr>
+          <w:color w:val="000000"/>
+          <w:sz w:val="20"/>
+        </w:rPr>
+        <w:t xml:space="preserve">{{ </w:t>
+      </w:r>
+      <w:proofErr w:type="spellStart"/>
+      <w:r>
+        <w:rPr>
+          <w:color w:val="000000"/>
+          <w:sz w:val="20"/>
+        </w:rPr>
+        <w:t>dokument_data.reprezentant_firmy</w:t>
+      </w:r>
+      <w:proofErr w:type="spellEnd"/>
+      <w:r>
+        <w:rPr>
+          <w:color w:val="000000"/>
+          <w:sz w:val="20"/>
+        </w:rPr>
+        <w:t xml:space="preserve"> }}</w:t>
       </w:r>
     </w:p>
     <w:p>
@@ -1479,10 +1770,10 @@
           <w:color w:val="000000"/>
           <w:sz w:val="20"/>
         </w:rPr>
+        <w:lastRenderedPageBreak/>
         <w:t>w imieniu Zakładu pracy)</w:t>
       </w:r>
     </w:p>
-    <w:p/>
     <w:sectPr>
       <w:headerReference w:type="default" r:id="rId7"/>
       <w:pgSz w:w="11906" w:h="16838"/>
@@ -1864,6 +2155,50 @@
     <w:lsdException w:name="Subtitle" w:qFormat="1"/>
     <w:lsdException w:name="Strong" w:qFormat="1"/>
     <w:lsdException w:name="Emphasis" w:qFormat="1"/>
+    <w:lsdException w:name="Normal Table" w:semiHidden="1" w:unhideWhenUsed="1"/>
+    <w:lsdException w:name="Table Simple 1" w:semiHidden="1" w:unhideWhenUsed="1"/>
+    <w:lsdException w:name="Table Simple 2" w:semiHidden="1" w:unhideWhenUsed="1"/>
+    <w:lsdException w:name="Table Simple 3" w:semiHidden="1" w:unhideWhenUsed="1"/>
+    <w:lsdException w:name="Table Classic 1" w:semiHidden="1" w:unhideWhenUsed="1"/>
+    <w:lsdException w:name="Table Classic 2" w:semiHidden="1" w:unhideWhenUsed="1"/>
+    <w:lsdException w:name="Table Classic 3" w:semiHidden="1" w:unhideWhenUsed="1"/>
+    <w:lsdException w:name="Table Classic 4" w:semiHidden="1" w:unhideWhenUsed="1"/>
+    <w:lsdException w:name="Table Colorful 1" w:semiHidden="1" w:unhideWhenUsed="1"/>
+    <w:lsdException w:name="Table Colorful 2" w:semiHidden="1" w:unhideWhenUsed="1"/>
+    <w:lsdException w:name="Table Colorful 3" w:semiHidden="1" w:unhideWhenUsed="1"/>
+    <w:lsdException w:name="Table Columns 1" w:semiHidden="1" w:unhideWhenUsed="1"/>
+    <w:lsdException w:name="Table Columns 2" w:semiHidden="1" w:unhideWhenUsed="1"/>
+    <w:lsdException w:name="Table Columns 3" w:semiHidden="1" w:unhideWhenUsed="1"/>
+    <w:lsdException w:name="Table Columns 4" w:semiHidden="1" w:unhideWhenUsed="1"/>
+    <w:lsdException w:name="Table Columns 5" w:semiHidden="1" w:unhideWhenUsed="1"/>
+    <w:lsdException w:name="Table Grid 1" w:semiHidden="1" w:unhideWhenUsed="1"/>
+    <w:lsdException w:name="Table Grid 2" w:semiHidden="1" w:unhideWhenUsed="1"/>
+    <w:lsdException w:name="Table Grid 3" w:semiHidden="1" w:unhideWhenUsed="1"/>
+    <w:lsdException w:name="Table Grid 4" w:semiHidden="1" w:unhideWhenUsed="1"/>
+    <w:lsdException w:name="Table Grid 5" w:semiHidden="1" w:unhideWhenUsed="1"/>
+    <w:lsdException w:name="Table Grid 6" w:semiHidden="1" w:unhideWhenUsed="1"/>
+    <w:lsdException w:name="Table Grid 7" w:semiHidden="1" w:unhideWhenUsed="1"/>
+    <w:lsdException w:name="Table Grid 8" w:semiHidden="1" w:unhideWhenUsed="1"/>
+    <w:lsdException w:name="Table List 1" w:semiHidden="1" w:unhideWhenUsed="1"/>
+    <w:lsdException w:name="Table List 2" w:semiHidden="1" w:unhideWhenUsed="1"/>
+    <w:lsdException w:name="Table List 3" w:semiHidden="1" w:unhideWhenUsed="1"/>
+    <w:lsdException w:name="Table List 4" w:semiHidden="1" w:unhideWhenUsed="1"/>
+    <w:lsdException w:name="Table List 5" w:semiHidden="1" w:unhideWhenUsed="1"/>
+    <w:lsdException w:name="Table List 6" w:semiHidden="1" w:unhideWhenUsed="1"/>
+    <w:lsdException w:name="Table List 7" w:semiHidden="1" w:unhideWhenUsed="1"/>
+    <w:lsdException w:name="Table List 8" w:semiHidden="1" w:unhideWhenUsed="1"/>
+    <w:lsdException w:name="Table 3D effects 1" w:semiHidden="1" w:unhideWhenUsed="1"/>
+    <w:lsdException w:name="Table 3D effects 2" w:semiHidden="1" w:unhideWhenUsed="1"/>
+    <w:lsdException w:name="Table 3D effects 3" w:semiHidden="1" w:unhideWhenUsed="1"/>
+    <w:lsdException w:name="Table Contemporary" w:semiHidden="1" w:unhideWhenUsed="1"/>
+    <w:lsdException w:name="Table Elegant" w:semiHidden="1" w:unhideWhenUsed="1"/>
+    <w:lsdException w:name="Table Professional" w:semiHidden="1" w:unhideWhenUsed="1"/>
+    <w:lsdException w:name="Table Subtle 1" w:semiHidden="1" w:unhideWhenUsed="1"/>
+    <w:lsdException w:name="Table Subtle 2" w:semiHidden="1" w:unhideWhenUsed="1"/>
+    <w:lsdException w:name="Table Web 1" w:semiHidden="1" w:unhideWhenUsed="1"/>
+    <w:lsdException w:name="Table Web 2" w:semiHidden="1" w:unhideWhenUsed="1"/>
+    <w:lsdException w:name="Table Web 3" w:semiHidden="1" w:unhideWhenUsed="1"/>
+    <w:lsdException w:name="Table Theme" w:semiHidden="1" w:unhideWhenUsed="1"/>
     <w:lsdException w:name="Placeholder Text" w:semiHidden="1" w:uiPriority="99"/>
     <w:lsdException w:name="No Spacing" w:uiPriority="1" w:qFormat="1"/>
     <w:lsdException w:name="Light Shading" w:uiPriority="60"/>
@@ -2117,11 +2452,15 @@
   </w:style>
   <w:style w:type="character" w:default="1" w:styleId="Domylnaczcionkaakapitu">
     <w:name w:val="Default Paragraph Font"/>
+    <w:uiPriority w:val="1"/>
     <w:semiHidden/>
+    <w:unhideWhenUsed/>
   </w:style>
   <w:style w:type="table" w:default="1" w:styleId="Standardowy">
     <w:name w:val="Normal Table"/>
+    <w:uiPriority w:val="99"/>
     <w:semiHidden/>
+    <w:unhideWhenUsed/>
     <w:tblPr>
       <w:tblInd w:w="0" w:type="dxa"/>
       <w:tblCellMar>
@@ -2134,7 +2473,9 @@
   </w:style>
   <w:style w:type="numbering" w:default="1" w:styleId="Bezlisty">
     <w:name w:val="No List"/>
+    <w:uiPriority w:val="99"/>
     <w:semiHidden/>
+    <w:unhideWhenUsed/>
   </w:style>
   <w:style w:type="paragraph" w:styleId="NormalnyWeb">
     <w:name w:val="Normal (Web)"/>

</xml_diff>